<commit_message>
Technical Reference 1.1.3 and Test Plan 1.0.1 rebuilt with the enterprise UI standard and the UI standard check
</commit_message>
<xml_diff>
--- a/docs/package/05_Delivery/BrokerVerse_Test_Plan.docx
+++ b/docs/package/05_Delivery/BrokerVerse_Test_Plan.docx
@@ -10,7 +10,7 @@
       <w:r>
         <w:rPr/>
         <w:drawing>
-          <wp:anchor behindDoc="1" distT="0" distB="0" distL="0" distR="0" simplePos="0" locked="0" layoutInCell="0" allowOverlap="1" relativeHeight="21">
+          <wp:anchor behindDoc="1" distT="0" distB="0" distL="0" distR="0" simplePos="0" locked="0" layoutInCell="0" allowOverlap="1" relativeHeight="22">
             <wp:simplePos x="0" y="0"/>
             <wp:positionH relativeFrom="margin">
               <wp:posOffset>-914400</wp:posOffset>
@@ -55,7 +55,7 @@
           </wp:anchor>
         </w:drawing>
         <w:drawing>
-          <wp:anchor behindDoc="1" distT="0" distB="0" distL="0" distR="0" simplePos="0" locked="0" layoutInCell="0" allowOverlap="1" relativeHeight="32">
+          <wp:anchor behindDoc="1" distT="0" distB="0" distL="0" distR="0" simplePos="0" locked="0" layoutInCell="0" allowOverlap="1" relativeHeight="33">
             <wp:simplePos x="0" y="0"/>
             <wp:positionH relativeFrom="margin">
               <wp:align>center</wp:align>
@@ -111,7 +111,7 @@
         <mc:AlternateContent>
           <mc:Choice Requires="wps">
             <w:drawing>
-              <wp:anchor behindDoc="0" distT="45720" distB="45720" distL="114300" distR="114300" simplePos="0" locked="0" layoutInCell="0" allowOverlap="1" relativeHeight="22" wp14:anchorId="3D43415C">
+              <wp:anchor behindDoc="0" distT="45720" distB="45720" distL="114300" distR="114300" simplePos="0" locked="0" layoutInCell="0" allowOverlap="1" relativeHeight="23" wp14:anchorId="3D43415C">
                 <wp:simplePos x="0" y="0"/>
                 <wp:positionH relativeFrom="page">
                   <wp:posOffset>194310</wp:posOffset>
@@ -226,7 +226,7 @@
         <mc:AlternateContent>
           <mc:Choice Requires="wps">
             <w:drawing>
-              <wp:anchor behindDoc="0" distT="45720" distB="45720" distL="113030" distR="114935" simplePos="0" locked="0" layoutInCell="0" allowOverlap="1" relativeHeight="24" wp14:anchorId="58C23128">
+              <wp:anchor behindDoc="0" distT="45720" distB="45720" distL="113030" distR="114935" simplePos="0" locked="0" layoutInCell="0" allowOverlap="1" relativeHeight="25" wp14:anchorId="58C23128">
                 <wp:simplePos x="0" y="0"/>
                 <wp:positionH relativeFrom="page">
                   <wp:posOffset>3094990</wp:posOffset>
@@ -341,7 +341,7 @@
         <mc:AlternateContent>
           <mc:Choice Requires="wps">
             <w:drawing>
-              <wp:anchor behindDoc="0" distT="45720" distB="45720" distL="114300" distR="113665" simplePos="0" locked="0" layoutInCell="0" allowOverlap="1" relativeHeight="26" wp14:anchorId="1BF25123">
+              <wp:anchor behindDoc="0" distT="45720" distB="45720" distL="114300" distR="113665" simplePos="0" locked="0" layoutInCell="0" allowOverlap="1" relativeHeight="27" wp14:anchorId="1BF25123">
                 <wp:simplePos x="0" y="0"/>
                 <wp:positionH relativeFrom="page">
                   <wp:posOffset>4992370</wp:posOffset>
@@ -456,7 +456,7 @@
         <mc:AlternateContent>
           <mc:Choice Requires="wps">
             <w:drawing>
-              <wp:anchor behindDoc="0" distT="45720" distB="46355" distL="114300" distR="114300" simplePos="0" locked="0" layoutInCell="0" allowOverlap="1" relativeHeight="28" wp14:anchorId="01DE2BF4">
+              <wp:anchor behindDoc="0" distT="45720" distB="46355" distL="114300" distR="114300" simplePos="0" locked="0" layoutInCell="0" allowOverlap="1" relativeHeight="29" wp14:anchorId="01DE2BF4">
                 <wp:simplePos x="0" y="0"/>
                 <wp:positionH relativeFrom="margin">
                   <wp:align>center</wp:align>
@@ -601,7 +601,7 @@
         <mc:AlternateContent>
           <mc:Choice Requires="wps">
             <w:drawing>
-              <wp:anchor behindDoc="0" distT="45720" distB="50800" distL="114300" distR="114300" simplePos="0" locked="0" layoutInCell="0" allowOverlap="1" relativeHeight="30" wp14:anchorId="204C02CC">
+              <wp:anchor behindDoc="0" distT="45720" distB="50800" distL="114300" distR="114300" simplePos="0" locked="0" layoutInCell="0" allowOverlap="1" relativeHeight="31" wp14:anchorId="204C02CC">
                 <wp:simplePos x="0" y="0"/>
                 <wp:positionH relativeFrom="margin">
                   <wp:align>center</wp:align>
@@ -789,7 +789,7 @@
             </w:rPr>
             <w:fldChar w:fldCharType="separate"/>
           </w:r>
-          <w:hyperlink w:anchor="__RefHeading___Toc14847_1139806449">
+          <w:hyperlink w:anchor="__RefHeading___Toc3336_449795556">
             <w:r>
               <w:rPr>
                 <w:webHidden/>
@@ -824,7 +824,7 @@
             </w:tabs>
             <w:rPr/>
           </w:pPr>
-          <w:hyperlink w:anchor="__RefHeading___Toc14849_1139806449">
+          <w:hyperlink w:anchor="__RefHeading___Toc3338_449795556">
             <w:r>
               <w:rPr>
                 <w:webHidden/>
@@ -853,7 +853,7 @@
             </w:tabs>
             <w:rPr/>
           </w:pPr>
-          <w:hyperlink w:anchor="__RefHeading___Toc14851_1139806449">
+          <w:hyperlink w:anchor="__RefHeading___Toc3340_449795556">
             <w:r>
               <w:rPr>
                 <w:webHidden/>
@@ -875,7 +875,7 @@
             </w:tabs>
             <w:rPr/>
           </w:pPr>
-          <w:hyperlink w:anchor="__RefHeading___Toc14853_1139806449">
+          <w:hyperlink w:anchor="__RefHeading___Toc3342_449795556">
             <w:r>
               <w:rPr>
                 <w:webHidden/>
@@ -897,7 +897,7 @@
             </w:tabs>
             <w:rPr/>
           </w:pPr>
-          <w:hyperlink w:anchor="__RefHeading___Toc14855_1139806449">
+          <w:hyperlink w:anchor="__RefHeading___Toc3344_449795556">
             <w:r>
               <w:rPr>
                 <w:webHidden/>
@@ -919,7 +919,7 @@
             </w:tabs>
             <w:rPr/>
           </w:pPr>
-          <w:hyperlink w:anchor="__RefHeading___Toc14857_1139806449">
+          <w:hyperlink w:anchor="__RefHeading___Toc3346_449795556">
             <w:r>
               <w:rPr>
                 <w:webHidden/>
@@ -941,7 +941,7 @@
             </w:tabs>
             <w:rPr/>
           </w:pPr>
-          <w:hyperlink w:anchor="__RefHeading___Toc14859_1139806449">
+          <w:hyperlink w:anchor="__RefHeading___Toc3348_449795556">
             <w:r>
               <w:rPr>
                 <w:webHidden/>
@@ -963,15 +963,37 @@
             </w:tabs>
             <w:rPr/>
           </w:pPr>
-          <w:hyperlink w:anchor="__RefHeading___Toc14861_1139806449">
+          <w:hyperlink w:anchor="__RefHeading___Toc3350_449795556">
             <w:r>
               <w:rPr>
                 <w:webHidden/>
                 <w:rStyle w:val="IndexLink"/>
               </w:rPr>
-              <w:t>4.2 Out of scope</w:t>
+              <w:t>4.2 UI standard check</w:t>
               <w:tab/>
               <w:t>8</w:t>
+            </w:r>
+          </w:hyperlink>
+        </w:p>
+        <w:p>
+          <w:pPr>
+            <w:pStyle w:val="TOC2"/>
+            <w:tabs>
+              <w:tab w:val="clear" w:pos="900"/>
+              <w:tab w:val="clear" w:pos="9350"/>
+              <w:tab w:val="right" w:pos="9025" w:leader="dot"/>
+            </w:tabs>
+            <w:rPr/>
+          </w:pPr>
+          <w:hyperlink w:anchor="__RefHeading___Toc3352_449795556">
+            <w:r>
+              <w:rPr>
+                <w:webHidden/>
+                <w:rStyle w:val="IndexLink"/>
+              </w:rPr>
+              <w:t>4.3 Out of scope</w:t>
+              <w:tab/>
+              <w:t>9</w:t>
             </w:r>
           </w:hyperlink>
         </w:p>
@@ -985,7 +1007,7 @@
             </w:tabs>
             <w:rPr/>
           </w:pPr>
-          <w:hyperlink w:anchor="__RefHeading___Toc14863_1139806449">
+          <w:hyperlink w:anchor="__RefHeading___Toc3354_449795556">
             <w:r>
               <w:rPr>
                 <w:webHidden/>
@@ -993,7 +1015,7 @@
               </w:rPr>
               <w:t>5. Schedule</w:t>
               <w:tab/>
-              <w:t>9</w:t>
+              <w:t>10</w:t>
             </w:r>
           </w:hyperlink>
         </w:p>
@@ -1007,7 +1029,7 @@
             </w:tabs>
             <w:rPr/>
           </w:pPr>
-          <w:hyperlink w:anchor="__RefHeading___Toc14865_1139806449">
+          <w:hyperlink w:anchor="__RefHeading___Toc3356_449795556">
             <w:r>
               <w:rPr>
                 <w:webHidden/>
@@ -1015,7 +1037,7 @@
               </w:rPr>
               <w:t>5.1 Test activities by phase</w:t>
               <w:tab/>
-              <w:t>9</w:t>
+              <w:t>10</w:t>
             </w:r>
           </w:hyperlink>
         </w:p>
@@ -1029,7 +1051,7 @@
             </w:tabs>
             <w:rPr/>
           </w:pPr>
-          <w:hyperlink w:anchor="__RefHeading___Toc14867_1139806449">
+          <w:hyperlink w:anchor="__RefHeading___Toc3358_449795556">
             <w:r>
               <w:rPr>
                 <w:webHidden/>
@@ -1037,7 +1059,7 @@
               </w:rPr>
               <w:t>5.2 Test cycles</w:t>
               <w:tab/>
-              <w:t>9</w:t>
+              <w:t>10</w:t>
             </w:r>
           </w:hyperlink>
         </w:p>
@@ -1051,7 +1073,7 @@
             </w:tabs>
             <w:rPr/>
           </w:pPr>
-          <w:hyperlink w:anchor="__RefHeading___Toc14869_1139806449">
+          <w:hyperlink w:anchor="__RefHeading___Toc3360_449795556">
             <w:r>
               <w:rPr>
                 <w:webHidden/>
@@ -1059,7 +1081,7 @@
               </w:rPr>
               <w:t>5.3 Calendar by broker size</w:t>
               <w:tab/>
-              <w:t>10</w:t>
+              <w:t>11</w:t>
             </w:r>
           </w:hyperlink>
         </w:p>
@@ -1073,7 +1095,7 @@
             </w:tabs>
             <w:rPr/>
           </w:pPr>
-          <w:hyperlink w:anchor="__RefHeading___Toc14871_1139806449">
+          <w:hyperlink w:anchor="__RefHeading___Toc3362_449795556">
             <w:r>
               <w:rPr>
                 <w:webHidden/>
@@ -1081,7 +1103,7 @@
               </w:rPr>
               <w:t>6. Test cases and traceability</w:t>
               <w:tab/>
-              <w:t>11</w:t>
+              <w:t>12</w:t>
             </w:r>
           </w:hyperlink>
         </w:p>
@@ -1095,7 +1117,7 @@
             </w:tabs>
             <w:rPr/>
           </w:pPr>
-          <w:hyperlink w:anchor="__RefHeading___Toc14873_1139806449">
+          <w:hyperlink w:anchor="__RefHeading___Toc3364_449795556">
             <w:r>
               <w:rPr>
                 <w:webHidden/>
@@ -1103,7 +1125,7 @@
               </w:rPr>
               <w:t>7. Deliverables</w:t>
               <w:tab/>
-              <w:t>12</w:t>
+              <w:t>13</w:t>
             </w:r>
           </w:hyperlink>
         </w:p>
@@ -1117,7 +1139,7 @@
             </w:tabs>
             <w:rPr/>
           </w:pPr>
-          <w:hyperlink w:anchor="__RefHeading___Toc14875_1139806449">
+          <w:hyperlink w:anchor="__RefHeading___Toc3366_449795556">
             <w:r>
               <w:rPr>
                 <w:webHidden/>
@@ -1125,7 +1147,7 @@
               </w:rPr>
               <w:t>8. Resourcing</w:t>
               <w:tab/>
-              <w:t>13</w:t>
+              <w:t>14</w:t>
             </w:r>
           </w:hyperlink>
         </w:p>
@@ -1139,7 +1161,7 @@
             </w:tabs>
             <w:rPr/>
           </w:pPr>
-          <w:hyperlink w:anchor="__RefHeading___Toc14877_1139806449">
+          <w:hyperlink w:anchor="__RefHeading___Toc3368_449795556">
             <w:r>
               <w:rPr>
                 <w:webHidden/>
@@ -1147,7 +1169,7 @@
               </w:rPr>
               <w:t>9. Suspension and resumption</w:t>
               <w:tab/>
-              <w:t>14</w:t>
+              <w:t>15</w:t>
             </w:r>
           </w:hyperlink>
         </w:p>
@@ -1161,7 +1183,7 @@
             </w:tabs>
             <w:rPr/>
           </w:pPr>
-          <w:hyperlink w:anchor="__RefHeading___Toc14879_1139806449">
+          <w:hyperlink w:anchor="__RefHeading___Toc3370_449795556">
             <w:r>
               <w:rPr>
                 <w:webHidden/>
@@ -1169,7 +1191,7 @@
               </w:rPr>
               <w:t>9.1 Suspension criteria</w:t>
               <w:tab/>
-              <w:t>14</w:t>
+              <w:t>15</w:t>
             </w:r>
           </w:hyperlink>
         </w:p>
@@ -1183,7 +1205,7 @@
             </w:tabs>
             <w:rPr/>
           </w:pPr>
-          <w:hyperlink w:anchor="__RefHeading___Toc14881_1139806449">
+          <w:hyperlink w:anchor="__RefHeading___Toc3372_449795556">
             <w:r>
               <w:rPr>
                 <w:webHidden/>
@@ -1191,7 +1213,7 @@
               </w:rPr>
               <w:t>9.2 Resumption criteria</w:t>
               <w:tab/>
-              <w:t>14</w:t>
+              <w:t>15</w:t>
             </w:r>
           </w:hyperlink>
         </w:p>
@@ -1205,7 +1227,7 @@
             </w:tabs>
             <w:rPr/>
           </w:pPr>
-          <w:hyperlink w:anchor="__RefHeading___Toc14883_1139806449">
+          <w:hyperlink w:anchor="__RefHeading___Toc3374_449795556">
             <w:r>
               <w:rPr>
                 <w:webHidden/>
@@ -1213,7 +1235,7 @@
               </w:rPr>
               <w:t>10. Sign-off</w:t>
               <w:tab/>
-              <w:t>15</w:t>
+              <w:t>16</w:t>
             </w:r>
           </w:hyperlink>
         </w:p>
@@ -1227,7 +1249,7 @@
             </w:tabs>
             <w:rPr/>
           </w:pPr>
-          <w:hyperlink w:anchor="__RefHeading___Toc14885_1139806449">
+          <w:hyperlink w:anchor="__RefHeading___Toc3376_449795556">
             <w:r>
               <w:rPr>
                 <w:webHidden/>
@@ -1242,7 +1264,7 @@
                 <w:rStyle w:val="IndexLink"/>
               </w:rPr>
               <w:tab/>
-              <w:t>16</w:t>
+              <w:t>17</w:t>
             </w:r>
           </w:hyperlink>
           <w:r>
@@ -1275,7 +1297,7 @@
       <w:r>
         <w:br w:type="page"/>
       </w:r>
-      <w:bookmarkStart w:id="0" w:name="__RefHeading___Toc14847_1139806449"/>
+      <w:bookmarkStart w:id="0" w:name="__RefHeading___Toc3336_449795556"/>
       <w:bookmarkStart w:id="1" w:name="_Toc48319687"/>
       <w:bookmarkStart w:id="2" w:name="_Toc11824118"/>
       <w:bookmarkEnd w:id="0"/>
@@ -1669,7 +1691,7 @@
                 <w:szCs w:val="24"/>
                 <w:lang w:val="en-US" w:eastAsia="ja-JP" w:bidi="ar-SA"/>
               </w:rPr>
-              <w:t>1.0</w:t>
+              <w:t>1.0.1</w:t>
             </w:r>
           </w:p>
         </w:tc>
@@ -1815,7 +1837,7 @@
                 <w:szCs w:val="24"/>
                 <w:lang w:val="en-US" w:eastAsia="ja-JP" w:bidi="ar-SA"/>
               </w:rPr>
-              <w:t>Initial issue: scope per module, schedule by phase and broker size, test cycles from SIT to hypercare, deliverables, resourcing, suspension and resumption, sign-off</w:t>
+              <w:t>Version 1.0.1: UI standard check added to the scope and to SIT cycle 1 (the Enterprise UI standard of the Technical Reference applied to every screen). Version 1.0: initial issue: scope per module, schedule by phase and broker size, test cycles from SIT to hypercare, deliverables, resourcing, suspension and resumption, sign-off</w:t>
             </w:r>
           </w:p>
         </w:tc>
@@ -1918,7 +1940,7 @@
           <w:spacing w:val="0"/>
         </w:rPr>
       </w:pPr>
-      <w:bookmarkStart w:id="4" w:name="__RefHeading___Toc14849_1139806449"/>
+      <w:bookmarkStart w:id="4" w:name="__RefHeading___Toc3338_449795556"/>
       <w:bookmarkStart w:id="5" w:name="_Toc233203388"/>
       <w:bookmarkEnd w:id="4"/>
       <w:r>
@@ -4092,7 +4114,7 @@
         <w:pageBreakBefore w:val="false"/>
         <w:rPr/>
       </w:pPr>
-      <w:bookmarkStart w:id="6" w:name="__RefHeading___Toc14851_1139806449"/>
+      <w:bookmarkStart w:id="6" w:name="__RefHeading___Toc3340_449795556"/>
       <w:bookmarkEnd w:id="6"/>
       <w:r>
         <w:rPr>
@@ -4109,7 +4131,7 @@
         <w:pStyle w:val="Heading2"/>
         <w:rPr/>
       </w:pPr>
-      <w:bookmarkStart w:id="7" w:name="__RefHeading___Toc14853_1139806449"/>
+      <w:bookmarkStart w:id="7" w:name="__RefHeading___Toc3342_449795556"/>
       <w:bookmarkEnd w:id="7"/>
       <w:r>
         <w:rPr>
@@ -4808,7 +4830,7 @@
         <w:pStyle w:val="Heading2"/>
         <w:rPr/>
       </w:pPr>
-      <w:bookmarkStart w:id="8" w:name="__RefHeading___Toc14855_1139806449"/>
+      <w:bookmarkStart w:id="8" w:name="__RefHeading___Toc3344_449795556"/>
       <w:bookmarkEnd w:id="8"/>
       <w:r>
         <w:rPr>
@@ -5470,7 +5492,7 @@
       <w:r>
         <w:br w:type="page"/>
       </w:r>
-      <w:bookmarkStart w:id="9" w:name="__RefHeading___Toc14857_1139806449"/>
+      <w:bookmarkStart w:id="9" w:name="__RefHeading___Toc3346_449795556"/>
       <w:bookmarkEnd w:id="9"/>
       <w:r>
         <w:rPr>
@@ -5487,7 +5509,7 @@
         <w:pStyle w:val="Heading2"/>
         <w:rPr/>
       </w:pPr>
-      <w:bookmarkStart w:id="10" w:name="__RefHeading___Toc14859_1139806449"/>
+      <w:bookmarkStart w:id="10" w:name="__RefHeading___Toc3348_449795556"/>
       <w:bookmarkEnd w:id="10"/>
       <w:r>
         <w:rPr>
@@ -5517,7 +5539,7 @@
     <w:tbl>
       <w:tblPr>
         <w:tblStyle w:val="TableGrid"/>
-        <w:tblW w:w="9013" w:type="dxa"/>
+        <w:tblW w:w="9014" w:type="dxa"/>
         <w:jc w:val="left"/>
         <w:tblInd w:w="0" w:type="dxa"/>
         <w:tblLayout w:type="fixed"/>
@@ -5530,10 +5552,10 @@
         <w:tblLook w:val="04a0" w:noHBand="0" w:noVBand="1" w:firstColumn="1" w:lastRow="0" w:lastColumn="0" w:firstRow="1"/>
       </w:tblPr>
       <w:tblGrid>
-        <w:gridCol w:w="2109"/>
-        <w:gridCol w:w="2301"/>
-        <w:gridCol w:w="2301"/>
-        <w:gridCol w:w="2301"/>
+        <w:gridCol w:w="2416"/>
+        <w:gridCol w:w="2418"/>
+        <w:gridCol w:w="2416"/>
+        <w:gridCol w:w="1763"/>
       </w:tblGrid>
       <w:tr>
         <w:trPr>
@@ -5541,7 +5563,7 @@
         </w:trPr>
         <w:tc>
           <w:tcPr>
-            <w:tcW w:w="2109" w:type="dxa"/>
+            <w:tcW w:w="2416" w:type="dxa"/>
             <w:tcBorders>
               <w:top w:val="single" w:sz="4" w:space="0" w:color="BFC7D1"/>
               <w:left w:val="single" w:sz="4" w:space="0" w:color="BFC7D1"/>
@@ -5580,7 +5602,7 @@
         </w:tc>
         <w:tc>
           <w:tcPr>
-            <w:tcW w:w="2301" w:type="dxa"/>
+            <w:tcW w:w="2418" w:type="dxa"/>
             <w:tcBorders>
               <w:top w:val="single" w:sz="4" w:space="0" w:color="BFC7D1"/>
               <w:left w:val="single" w:sz="4" w:space="0" w:color="BFC7D1"/>
@@ -5619,7 +5641,7 @@
         </w:tc>
         <w:tc>
           <w:tcPr>
-            <w:tcW w:w="2301" w:type="dxa"/>
+            <w:tcW w:w="2416" w:type="dxa"/>
             <w:tcBorders>
               <w:top w:val="single" w:sz="4" w:space="0" w:color="BFC7D1"/>
               <w:left w:val="single" w:sz="4" w:space="0" w:color="BFC7D1"/>
@@ -5658,7 +5680,7 @@
         </w:tc>
         <w:tc>
           <w:tcPr>
-            <w:tcW w:w="2301" w:type="dxa"/>
+            <w:tcW w:w="1763" w:type="dxa"/>
             <w:tcBorders>
               <w:top w:val="single" w:sz="4" w:space="0" w:color="BFC7D1"/>
               <w:left w:val="single" w:sz="4" w:space="0" w:color="BFC7D1"/>
@@ -5700,7 +5722,7 @@
         <w:trPr/>
         <w:tc>
           <w:tcPr>
-            <w:tcW w:w="2109" w:type="dxa"/>
+            <w:tcW w:w="2416" w:type="dxa"/>
             <w:tcBorders>
               <w:top w:val="single" w:sz="4" w:space="0" w:color="BFC7D1"/>
               <w:left w:val="single" w:sz="4" w:space="0" w:color="BFC7D1"/>
@@ -5737,7 +5759,7 @@
         </w:tc>
         <w:tc>
           <w:tcPr>
-            <w:tcW w:w="2301" w:type="dxa"/>
+            <w:tcW w:w="2418" w:type="dxa"/>
             <w:tcBorders>
               <w:top w:val="single" w:sz="4" w:space="0" w:color="BFC7D1"/>
               <w:left w:val="single" w:sz="4" w:space="0" w:color="BFC7D1"/>
@@ -5774,7 +5796,7 @@
         </w:tc>
         <w:tc>
           <w:tcPr>
-            <w:tcW w:w="2301" w:type="dxa"/>
+            <w:tcW w:w="2416" w:type="dxa"/>
             <w:tcBorders>
               <w:top w:val="single" w:sz="4" w:space="0" w:color="BFC7D1"/>
               <w:left w:val="single" w:sz="4" w:space="0" w:color="BFC7D1"/>
@@ -5811,7 +5833,7 @@
         </w:tc>
         <w:tc>
           <w:tcPr>
-            <w:tcW w:w="2301" w:type="dxa"/>
+            <w:tcW w:w="1763" w:type="dxa"/>
             <w:tcBorders>
               <w:top w:val="single" w:sz="4" w:space="0" w:color="BFC7D1"/>
               <w:left w:val="single" w:sz="4" w:space="0" w:color="BFC7D1"/>
@@ -5851,7 +5873,7 @@
         <w:trPr/>
         <w:tc>
           <w:tcPr>
-            <w:tcW w:w="2109" w:type="dxa"/>
+            <w:tcW w:w="2416" w:type="dxa"/>
             <w:tcBorders>
               <w:top w:val="single" w:sz="4" w:space="0" w:color="BFC7D1"/>
               <w:left w:val="single" w:sz="4" w:space="0" w:color="BFC7D1"/>
@@ -5888,7 +5910,7 @@
         </w:tc>
         <w:tc>
           <w:tcPr>
-            <w:tcW w:w="2301" w:type="dxa"/>
+            <w:tcW w:w="2418" w:type="dxa"/>
             <w:tcBorders>
               <w:top w:val="single" w:sz="4" w:space="0" w:color="BFC7D1"/>
               <w:left w:val="single" w:sz="4" w:space="0" w:color="BFC7D1"/>
@@ -5925,7 +5947,7 @@
         </w:tc>
         <w:tc>
           <w:tcPr>
-            <w:tcW w:w="2301" w:type="dxa"/>
+            <w:tcW w:w="2416" w:type="dxa"/>
             <w:tcBorders>
               <w:top w:val="single" w:sz="4" w:space="0" w:color="BFC7D1"/>
               <w:left w:val="single" w:sz="4" w:space="0" w:color="BFC7D1"/>
@@ -5962,7 +5984,7 @@
         </w:tc>
         <w:tc>
           <w:tcPr>
-            <w:tcW w:w="2301" w:type="dxa"/>
+            <w:tcW w:w="1763" w:type="dxa"/>
             <w:tcBorders>
               <w:top w:val="single" w:sz="4" w:space="0" w:color="BFC7D1"/>
               <w:left w:val="single" w:sz="4" w:space="0" w:color="BFC7D1"/>
@@ -6002,7 +6024,7 @@
         <w:trPr/>
         <w:tc>
           <w:tcPr>
-            <w:tcW w:w="2109" w:type="dxa"/>
+            <w:tcW w:w="2416" w:type="dxa"/>
             <w:tcBorders>
               <w:top w:val="single" w:sz="4" w:space="0" w:color="BFC7D1"/>
               <w:left w:val="single" w:sz="4" w:space="0" w:color="BFC7D1"/>
@@ -6039,7 +6061,7 @@
         </w:tc>
         <w:tc>
           <w:tcPr>
-            <w:tcW w:w="2301" w:type="dxa"/>
+            <w:tcW w:w="2418" w:type="dxa"/>
             <w:tcBorders>
               <w:top w:val="single" w:sz="4" w:space="0" w:color="BFC7D1"/>
               <w:left w:val="single" w:sz="4" w:space="0" w:color="BFC7D1"/>
@@ -6076,7 +6098,7 @@
         </w:tc>
         <w:tc>
           <w:tcPr>
-            <w:tcW w:w="2301" w:type="dxa"/>
+            <w:tcW w:w="2416" w:type="dxa"/>
             <w:tcBorders>
               <w:top w:val="single" w:sz="4" w:space="0" w:color="BFC7D1"/>
               <w:left w:val="single" w:sz="4" w:space="0" w:color="BFC7D1"/>
@@ -6113,7 +6135,7 @@
         </w:tc>
         <w:tc>
           <w:tcPr>
-            <w:tcW w:w="2301" w:type="dxa"/>
+            <w:tcW w:w="1763" w:type="dxa"/>
             <w:tcBorders>
               <w:top w:val="single" w:sz="4" w:space="0" w:color="BFC7D1"/>
               <w:left w:val="single" w:sz="4" w:space="0" w:color="BFC7D1"/>
@@ -6153,7 +6175,7 @@
         <w:trPr/>
         <w:tc>
           <w:tcPr>
-            <w:tcW w:w="2109" w:type="dxa"/>
+            <w:tcW w:w="2416" w:type="dxa"/>
             <w:tcBorders>
               <w:top w:val="single" w:sz="4" w:space="0" w:color="BFC7D1"/>
               <w:left w:val="single" w:sz="4" w:space="0" w:color="BFC7D1"/>
@@ -6190,7 +6212,7 @@
         </w:tc>
         <w:tc>
           <w:tcPr>
-            <w:tcW w:w="2301" w:type="dxa"/>
+            <w:tcW w:w="2418" w:type="dxa"/>
             <w:tcBorders>
               <w:top w:val="single" w:sz="4" w:space="0" w:color="BFC7D1"/>
               <w:left w:val="single" w:sz="4" w:space="0" w:color="BFC7D1"/>
@@ -6227,7 +6249,7 @@
         </w:tc>
         <w:tc>
           <w:tcPr>
-            <w:tcW w:w="2301" w:type="dxa"/>
+            <w:tcW w:w="2416" w:type="dxa"/>
             <w:tcBorders>
               <w:top w:val="single" w:sz="4" w:space="0" w:color="BFC7D1"/>
               <w:left w:val="single" w:sz="4" w:space="0" w:color="BFC7D1"/>
@@ -6264,7 +6286,7 @@
         </w:tc>
         <w:tc>
           <w:tcPr>
-            <w:tcW w:w="2301" w:type="dxa"/>
+            <w:tcW w:w="1763" w:type="dxa"/>
             <w:tcBorders>
               <w:top w:val="single" w:sz="4" w:space="0" w:color="BFC7D1"/>
               <w:left w:val="single" w:sz="4" w:space="0" w:color="BFC7D1"/>
@@ -6304,7 +6326,7 @@
         <w:trPr/>
         <w:tc>
           <w:tcPr>
-            <w:tcW w:w="2109" w:type="dxa"/>
+            <w:tcW w:w="2416" w:type="dxa"/>
             <w:tcBorders>
               <w:top w:val="single" w:sz="4" w:space="0" w:color="BFC7D1"/>
               <w:left w:val="single" w:sz="4" w:space="0" w:color="BFC7D1"/>
@@ -6341,7 +6363,7 @@
         </w:tc>
         <w:tc>
           <w:tcPr>
-            <w:tcW w:w="2301" w:type="dxa"/>
+            <w:tcW w:w="2418" w:type="dxa"/>
             <w:tcBorders>
               <w:top w:val="single" w:sz="4" w:space="0" w:color="BFC7D1"/>
               <w:left w:val="single" w:sz="4" w:space="0" w:color="BFC7D1"/>
@@ -6378,7 +6400,7 @@
         </w:tc>
         <w:tc>
           <w:tcPr>
-            <w:tcW w:w="2301" w:type="dxa"/>
+            <w:tcW w:w="2416" w:type="dxa"/>
             <w:tcBorders>
               <w:top w:val="single" w:sz="4" w:space="0" w:color="BFC7D1"/>
               <w:left w:val="single" w:sz="4" w:space="0" w:color="BFC7D1"/>
@@ -6415,7 +6437,7 @@
         </w:tc>
         <w:tc>
           <w:tcPr>
-            <w:tcW w:w="2301" w:type="dxa"/>
+            <w:tcW w:w="1763" w:type="dxa"/>
             <w:tcBorders>
               <w:top w:val="single" w:sz="4" w:space="0" w:color="BFC7D1"/>
               <w:left w:val="single" w:sz="4" w:space="0" w:color="BFC7D1"/>
@@ -6455,7 +6477,7 @@
         <w:trPr/>
         <w:tc>
           <w:tcPr>
-            <w:tcW w:w="2109" w:type="dxa"/>
+            <w:tcW w:w="2416" w:type="dxa"/>
             <w:tcBorders>
               <w:top w:val="single" w:sz="4" w:space="0" w:color="BFC7D1"/>
               <w:left w:val="single" w:sz="4" w:space="0" w:color="BFC7D1"/>
@@ -6492,7 +6514,7 @@
         </w:tc>
         <w:tc>
           <w:tcPr>
-            <w:tcW w:w="2301" w:type="dxa"/>
+            <w:tcW w:w="2418" w:type="dxa"/>
             <w:tcBorders>
               <w:top w:val="single" w:sz="4" w:space="0" w:color="BFC7D1"/>
               <w:left w:val="single" w:sz="4" w:space="0" w:color="BFC7D1"/>
@@ -6529,7 +6551,7 @@
         </w:tc>
         <w:tc>
           <w:tcPr>
-            <w:tcW w:w="2301" w:type="dxa"/>
+            <w:tcW w:w="2416" w:type="dxa"/>
             <w:tcBorders>
               <w:top w:val="single" w:sz="4" w:space="0" w:color="BFC7D1"/>
               <w:left w:val="single" w:sz="4" w:space="0" w:color="BFC7D1"/>
@@ -6566,7 +6588,7 @@
         </w:tc>
         <w:tc>
           <w:tcPr>
-            <w:tcW w:w="2301" w:type="dxa"/>
+            <w:tcW w:w="1763" w:type="dxa"/>
             <w:tcBorders>
               <w:top w:val="single" w:sz="4" w:space="0" w:color="BFC7D1"/>
               <w:left w:val="single" w:sz="4" w:space="0" w:color="BFC7D1"/>
@@ -6606,7 +6628,7 @@
         <w:trPr/>
         <w:tc>
           <w:tcPr>
-            <w:tcW w:w="2109" w:type="dxa"/>
+            <w:tcW w:w="2416" w:type="dxa"/>
             <w:tcBorders>
               <w:top w:val="single" w:sz="4" w:space="0" w:color="BFC7D1"/>
               <w:left w:val="single" w:sz="4" w:space="0" w:color="BFC7D1"/>
@@ -6643,7 +6665,7 @@
         </w:tc>
         <w:tc>
           <w:tcPr>
-            <w:tcW w:w="2301" w:type="dxa"/>
+            <w:tcW w:w="2418" w:type="dxa"/>
             <w:tcBorders>
               <w:top w:val="single" w:sz="4" w:space="0" w:color="BFC7D1"/>
               <w:left w:val="single" w:sz="4" w:space="0" w:color="BFC7D1"/>
@@ -6680,7 +6702,7 @@
         </w:tc>
         <w:tc>
           <w:tcPr>
-            <w:tcW w:w="2301" w:type="dxa"/>
+            <w:tcW w:w="2416" w:type="dxa"/>
             <w:tcBorders>
               <w:top w:val="single" w:sz="4" w:space="0" w:color="BFC7D1"/>
               <w:left w:val="single" w:sz="4" w:space="0" w:color="BFC7D1"/>
@@ -6717,7 +6739,7 @@
         </w:tc>
         <w:tc>
           <w:tcPr>
-            <w:tcW w:w="2301" w:type="dxa"/>
+            <w:tcW w:w="1763" w:type="dxa"/>
             <w:tcBorders>
               <w:top w:val="single" w:sz="4" w:space="0" w:color="BFC7D1"/>
               <w:left w:val="single" w:sz="4" w:space="0" w:color="BFC7D1"/>
@@ -6757,7 +6779,7 @@
         <w:trPr/>
         <w:tc>
           <w:tcPr>
-            <w:tcW w:w="2109" w:type="dxa"/>
+            <w:tcW w:w="2416" w:type="dxa"/>
             <w:tcBorders>
               <w:top w:val="single" w:sz="4" w:space="0" w:color="BFC7D1"/>
               <w:left w:val="single" w:sz="4" w:space="0" w:color="BFC7D1"/>
@@ -6794,7 +6816,7 @@
         </w:tc>
         <w:tc>
           <w:tcPr>
-            <w:tcW w:w="2301" w:type="dxa"/>
+            <w:tcW w:w="2418" w:type="dxa"/>
             <w:tcBorders>
               <w:top w:val="single" w:sz="4" w:space="0" w:color="BFC7D1"/>
               <w:left w:val="single" w:sz="4" w:space="0" w:color="BFC7D1"/>
@@ -6831,7 +6853,7 @@
         </w:tc>
         <w:tc>
           <w:tcPr>
-            <w:tcW w:w="2301" w:type="dxa"/>
+            <w:tcW w:w="2416" w:type="dxa"/>
             <w:tcBorders>
               <w:top w:val="single" w:sz="4" w:space="0" w:color="BFC7D1"/>
               <w:left w:val="single" w:sz="4" w:space="0" w:color="BFC7D1"/>
@@ -6868,7 +6890,7 @@
         </w:tc>
         <w:tc>
           <w:tcPr>
-            <w:tcW w:w="2301" w:type="dxa"/>
+            <w:tcW w:w="1763" w:type="dxa"/>
             <w:tcBorders>
               <w:top w:val="single" w:sz="4" w:space="0" w:color="BFC7D1"/>
               <w:left w:val="single" w:sz="4" w:space="0" w:color="BFC7D1"/>
@@ -6908,7 +6930,7 @@
         <w:trPr/>
         <w:tc>
           <w:tcPr>
-            <w:tcW w:w="2109" w:type="dxa"/>
+            <w:tcW w:w="2416" w:type="dxa"/>
             <w:tcBorders>
               <w:top w:val="single" w:sz="4" w:space="0" w:color="BFC7D1"/>
               <w:left w:val="single" w:sz="4" w:space="0" w:color="BFC7D1"/>
@@ -6945,7 +6967,7 @@
         </w:tc>
         <w:tc>
           <w:tcPr>
-            <w:tcW w:w="2301" w:type="dxa"/>
+            <w:tcW w:w="2418" w:type="dxa"/>
             <w:tcBorders>
               <w:top w:val="single" w:sz="4" w:space="0" w:color="BFC7D1"/>
               <w:left w:val="single" w:sz="4" w:space="0" w:color="BFC7D1"/>
@@ -6982,7 +7004,7 @@
         </w:tc>
         <w:tc>
           <w:tcPr>
-            <w:tcW w:w="2301" w:type="dxa"/>
+            <w:tcW w:w="2416" w:type="dxa"/>
             <w:tcBorders>
               <w:top w:val="single" w:sz="4" w:space="0" w:color="BFC7D1"/>
               <w:left w:val="single" w:sz="4" w:space="0" w:color="BFC7D1"/>
@@ -7019,7 +7041,7 @@
         </w:tc>
         <w:tc>
           <w:tcPr>
-            <w:tcW w:w="2301" w:type="dxa"/>
+            <w:tcW w:w="1763" w:type="dxa"/>
             <w:tcBorders>
               <w:top w:val="single" w:sz="4" w:space="0" w:color="BFC7D1"/>
               <w:left w:val="single" w:sz="4" w:space="0" w:color="BFC7D1"/>
@@ -7059,7 +7081,7 @@
         <w:trPr/>
         <w:tc>
           <w:tcPr>
-            <w:tcW w:w="2109" w:type="dxa"/>
+            <w:tcW w:w="2416" w:type="dxa"/>
             <w:tcBorders>
               <w:top w:val="single" w:sz="4" w:space="0" w:color="BFC7D1"/>
               <w:left w:val="single" w:sz="4" w:space="0" w:color="BFC7D1"/>
@@ -7096,7 +7118,7 @@
         </w:tc>
         <w:tc>
           <w:tcPr>
-            <w:tcW w:w="2301" w:type="dxa"/>
+            <w:tcW w:w="2418" w:type="dxa"/>
             <w:tcBorders>
               <w:top w:val="single" w:sz="4" w:space="0" w:color="BFC7D1"/>
               <w:left w:val="single" w:sz="4" w:space="0" w:color="BFC7D1"/>
@@ -7133,7 +7155,7 @@
         </w:tc>
         <w:tc>
           <w:tcPr>
-            <w:tcW w:w="2301" w:type="dxa"/>
+            <w:tcW w:w="2416" w:type="dxa"/>
             <w:tcBorders>
               <w:top w:val="single" w:sz="4" w:space="0" w:color="BFC7D1"/>
               <w:left w:val="single" w:sz="4" w:space="0" w:color="BFC7D1"/>
@@ -7170,7 +7192,7 @@
         </w:tc>
         <w:tc>
           <w:tcPr>
-            <w:tcW w:w="2301" w:type="dxa"/>
+            <w:tcW w:w="1763" w:type="dxa"/>
             <w:tcBorders>
               <w:top w:val="single" w:sz="4" w:space="0" w:color="BFC7D1"/>
               <w:left w:val="single" w:sz="4" w:space="0" w:color="BFC7D1"/>
@@ -7210,7 +7232,7 @@
         <w:trPr/>
         <w:tc>
           <w:tcPr>
-            <w:tcW w:w="2109" w:type="dxa"/>
+            <w:tcW w:w="2416" w:type="dxa"/>
             <w:tcBorders>
               <w:top w:val="single" w:sz="4" w:space="0" w:color="BFC7D1"/>
               <w:left w:val="single" w:sz="4" w:space="0" w:color="BFC7D1"/>
@@ -7247,7 +7269,7 @@
         </w:tc>
         <w:tc>
           <w:tcPr>
-            <w:tcW w:w="2301" w:type="dxa"/>
+            <w:tcW w:w="2418" w:type="dxa"/>
             <w:tcBorders>
               <w:top w:val="single" w:sz="4" w:space="0" w:color="BFC7D1"/>
               <w:left w:val="single" w:sz="4" w:space="0" w:color="BFC7D1"/>
@@ -7284,7 +7306,7 @@
         </w:tc>
         <w:tc>
           <w:tcPr>
-            <w:tcW w:w="2301" w:type="dxa"/>
+            <w:tcW w:w="2416" w:type="dxa"/>
             <w:tcBorders>
               <w:top w:val="single" w:sz="4" w:space="0" w:color="BFC7D1"/>
               <w:left w:val="single" w:sz="4" w:space="0" w:color="BFC7D1"/>
@@ -7321,7 +7343,7 @@
         </w:tc>
         <w:tc>
           <w:tcPr>
-            <w:tcW w:w="2301" w:type="dxa"/>
+            <w:tcW w:w="1763" w:type="dxa"/>
             <w:tcBorders>
               <w:top w:val="single" w:sz="4" w:space="0" w:color="BFC7D1"/>
               <w:left w:val="single" w:sz="4" w:space="0" w:color="BFC7D1"/>
@@ -7361,7 +7383,7 @@
         <w:trPr/>
         <w:tc>
           <w:tcPr>
-            <w:tcW w:w="2109" w:type="dxa"/>
+            <w:tcW w:w="2416" w:type="dxa"/>
             <w:tcBorders>
               <w:top w:val="single" w:sz="4" w:space="0" w:color="BFC7D1"/>
               <w:left w:val="single" w:sz="4" w:space="0" w:color="BFC7D1"/>
@@ -7398,7 +7420,7 @@
         </w:tc>
         <w:tc>
           <w:tcPr>
-            <w:tcW w:w="2301" w:type="dxa"/>
+            <w:tcW w:w="2418" w:type="dxa"/>
             <w:tcBorders>
               <w:top w:val="single" w:sz="4" w:space="0" w:color="BFC7D1"/>
               <w:left w:val="single" w:sz="4" w:space="0" w:color="BFC7D1"/>
@@ -7435,7 +7457,7 @@
         </w:tc>
         <w:tc>
           <w:tcPr>
-            <w:tcW w:w="2301" w:type="dxa"/>
+            <w:tcW w:w="2416" w:type="dxa"/>
             <w:tcBorders>
               <w:top w:val="single" w:sz="4" w:space="0" w:color="BFC7D1"/>
               <w:left w:val="single" w:sz="4" w:space="0" w:color="BFC7D1"/>
@@ -7472,7 +7494,7 @@
         </w:tc>
         <w:tc>
           <w:tcPr>
-            <w:tcW w:w="2301" w:type="dxa"/>
+            <w:tcW w:w="1763" w:type="dxa"/>
             <w:tcBorders>
               <w:top w:val="single" w:sz="4" w:space="0" w:color="BFC7D1"/>
               <w:left w:val="single" w:sz="4" w:space="0" w:color="BFC7D1"/>
@@ -7512,7 +7534,7 @@
         <w:trPr/>
         <w:tc>
           <w:tcPr>
-            <w:tcW w:w="2109" w:type="dxa"/>
+            <w:tcW w:w="2416" w:type="dxa"/>
             <w:tcBorders>
               <w:top w:val="single" w:sz="4" w:space="0" w:color="BFC7D1"/>
               <w:left w:val="single" w:sz="4" w:space="0" w:color="BFC7D1"/>
@@ -7549,7 +7571,7 @@
         </w:tc>
         <w:tc>
           <w:tcPr>
-            <w:tcW w:w="2301" w:type="dxa"/>
+            <w:tcW w:w="2418" w:type="dxa"/>
             <w:tcBorders>
               <w:top w:val="single" w:sz="4" w:space="0" w:color="BFC7D1"/>
               <w:left w:val="single" w:sz="4" w:space="0" w:color="BFC7D1"/>
@@ -7586,7 +7608,7 @@
         </w:tc>
         <w:tc>
           <w:tcPr>
-            <w:tcW w:w="2301" w:type="dxa"/>
+            <w:tcW w:w="2416" w:type="dxa"/>
             <w:tcBorders>
               <w:top w:val="single" w:sz="4" w:space="0" w:color="BFC7D1"/>
               <w:left w:val="single" w:sz="4" w:space="0" w:color="BFC7D1"/>
@@ -7623,7 +7645,7 @@
         </w:tc>
         <w:tc>
           <w:tcPr>
-            <w:tcW w:w="2301" w:type="dxa"/>
+            <w:tcW w:w="1763" w:type="dxa"/>
             <w:tcBorders>
               <w:top w:val="single" w:sz="4" w:space="0" w:color="BFC7D1"/>
               <w:left w:val="single" w:sz="4" w:space="0" w:color="BFC7D1"/>
@@ -7663,7 +7685,7 @@
         <w:trPr/>
         <w:tc>
           <w:tcPr>
-            <w:tcW w:w="2109" w:type="dxa"/>
+            <w:tcW w:w="2416" w:type="dxa"/>
             <w:tcBorders>
               <w:top w:val="single" w:sz="4" w:space="0" w:color="BFC7D1"/>
               <w:left w:val="single" w:sz="4" w:space="0" w:color="BFC7D1"/>
@@ -7700,7 +7722,7 @@
         </w:tc>
         <w:tc>
           <w:tcPr>
-            <w:tcW w:w="2301" w:type="dxa"/>
+            <w:tcW w:w="2418" w:type="dxa"/>
             <w:tcBorders>
               <w:top w:val="single" w:sz="4" w:space="0" w:color="BFC7D1"/>
               <w:left w:val="single" w:sz="4" w:space="0" w:color="BFC7D1"/>
@@ -7737,7 +7759,7 @@
         </w:tc>
         <w:tc>
           <w:tcPr>
-            <w:tcW w:w="2301" w:type="dxa"/>
+            <w:tcW w:w="2416" w:type="dxa"/>
             <w:tcBorders>
               <w:top w:val="single" w:sz="4" w:space="0" w:color="BFC7D1"/>
               <w:left w:val="single" w:sz="4" w:space="0" w:color="BFC7D1"/>
@@ -7774,7 +7796,7 @@
         </w:tc>
         <w:tc>
           <w:tcPr>
-            <w:tcW w:w="2301" w:type="dxa"/>
+            <w:tcW w:w="1763" w:type="dxa"/>
             <w:tcBorders>
               <w:top w:val="single" w:sz="4" w:space="0" w:color="BFC7D1"/>
               <w:left w:val="single" w:sz="4" w:space="0" w:color="BFC7D1"/>
@@ -7814,7 +7836,7 @@
         <w:trPr/>
         <w:tc>
           <w:tcPr>
-            <w:tcW w:w="2109" w:type="dxa"/>
+            <w:tcW w:w="2416" w:type="dxa"/>
             <w:tcBorders>
               <w:top w:val="single" w:sz="4" w:space="0" w:color="BFC7D1"/>
               <w:left w:val="single" w:sz="4" w:space="0" w:color="BFC7D1"/>
@@ -7851,7 +7873,7 @@
         </w:tc>
         <w:tc>
           <w:tcPr>
-            <w:tcW w:w="2301" w:type="dxa"/>
+            <w:tcW w:w="2418" w:type="dxa"/>
             <w:tcBorders>
               <w:top w:val="single" w:sz="4" w:space="0" w:color="BFC7D1"/>
               <w:left w:val="single" w:sz="4" w:space="0" w:color="BFC7D1"/>
@@ -7888,7 +7910,7 @@
         </w:tc>
         <w:tc>
           <w:tcPr>
-            <w:tcW w:w="2301" w:type="dxa"/>
+            <w:tcW w:w="2416" w:type="dxa"/>
             <w:tcBorders>
               <w:top w:val="single" w:sz="4" w:space="0" w:color="BFC7D1"/>
               <w:left w:val="single" w:sz="4" w:space="0" w:color="BFC7D1"/>
@@ -7925,7 +7947,7 @@
         </w:tc>
         <w:tc>
           <w:tcPr>
-            <w:tcW w:w="2301" w:type="dxa"/>
+            <w:tcW w:w="1763" w:type="dxa"/>
             <w:tcBorders>
               <w:top w:val="single" w:sz="4" w:space="0" w:color="BFC7D1"/>
               <w:left w:val="single" w:sz="4" w:space="0" w:color="BFC7D1"/>
@@ -7965,7 +7987,7 @@
         <w:trPr/>
         <w:tc>
           <w:tcPr>
-            <w:tcW w:w="2109" w:type="dxa"/>
+            <w:tcW w:w="2416" w:type="dxa"/>
             <w:tcBorders>
               <w:top w:val="single" w:sz="4" w:space="0" w:color="BFC7D1"/>
               <w:left w:val="single" w:sz="4" w:space="0" w:color="BFC7D1"/>
@@ -8002,7 +8024,7 @@
         </w:tc>
         <w:tc>
           <w:tcPr>
-            <w:tcW w:w="2301" w:type="dxa"/>
+            <w:tcW w:w="2418" w:type="dxa"/>
             <w:tcBorders>
               <w:top w:val="single" w:sz="4" w:space="0" w:color="BFC7D1"/>
               <w:left w:val="single" w:sz="4" w:space="0" w:color="BFC7D1"/>
@@ -8039,7 +8061,7 @@
         </w:tc>
         <w:tc>
           <w:tcPr>
-            <w:tcW w:w="2301" w:type="dxa"/>
+            <w:tcW w:w="2416" w:type="dxa"/>
             <w:tcBorders>
               <w:top w:val="single" w:sz="4" w:space="0" w:color="BFC7D1"/>
               <w:left w:val="single" w:sz="4" w:space="0" w:color="BFC7D1"/>
@@ -8076,7 +8098,7 @@
         </w:tc>
         <w:tc>
           <w:tcPr>
-            <w:tcW w:w="2301" w:type="dxa"/>
+            <w:tcW w:w="1763" w:type="dxa"/>
             <w:tcBorders>
               <w:top w:val="single" w:sz="4" w:space="0" w:color="BFC7D1"/>
               <w:left w:val="single" w:sz="4" w:space="0" w:color="BFC7D1"/>
@@ -8116,7 +8138,7 @@
         <w:trPr/>
         <w:tc>
           <w:tcPr>
-            <w:tcW w:w="2109" w:type="dxa"/>
+            <w:tcW w:w="2416" w:type="dxa"/>
             <w:tcBorders>
               <w:top w:val="single" w:sz="4" w:space="0" w:color="BFC7D1"/>
               <w:left w:val="single" w:sz="4" w:space="0" w:color="BFC7D1"/>
@@ -8153,7 +8175,7 @@
         </w:tc>
         <w:tc>
           <w:tcPr>
-            <w:tcW w:w="2301" w:type="dxa"/>
+            <w:tcW w:w="2418" w:type="dxa"/>
             <w:tcBorders>
               <w:top w:val="single" w:sz="4" w:space="0" w:color="BFC7D1"/>
               <w:left w:val="single" w:sz="4" w:space="0" w:color="BFC7D1"/>
@@ -8190,7 +8212,7 @@
         </w:tc>
         <w:tc>
           <w:tcPr>
-            <w:tcW w:w="2301" w:type="dxa"/>
+            <w:tcW w:w="2416" w:type="dxa"/>
             <w:tcBorders>
               <w:top w:val="single" w:sz="4" w:space="0" w:color="BFC7D1"/>
               <w:left w:val="single" w:sz="4" w:space="0" w:color="BFC7D1"/>
@@ -8227,7 +8249,7 @@
         </w:tc>
         <w:tc>
           <w:tcPr>
-            <w:tcW w:w="2301" w:type="dxa"/>
+            <w:tcW w:w="1763" w:type="dxa"/>
             <w:tcBorders>
               <w:top w:val="single" w:sz="4" w:space="0" w:color="BFC7D1"/>
               <w:left w:val="single" w:sz="4" w:space="0" w:color="BFC7D1"/>
@@ -8267,7 +8289,7 @@
         <w:trPr/>
         <w:tc>
           <w:tcPr>
-            <w:tcW w:w="2109" w:type="dxa"/>
+            <w:tcW w:w="2416" w:type="dxa"/>
             <w:tcBorders>
               <w:top w:val="single" w:sz="4" w:space="0" w:color="BFC7D1"/>
               <w:left w:val="single" w:sz="4" w:space="0" w:color="BFC7D1"/>
@@ -8304,7 +8326,7 @@
         </w:tc>
         <w:tc>
           <w:tcPr>
-            <w:tcW w:w="2301" w:type="dxa"/>
+            <w:tcW w:w="2418" w:type="dxa"/>
             <w:tcBorders>
               <w:top w:val="single" w:sz="4" w:space="0" w:color="BFC7D1"/>
               <w:left w:val="single" w:sz="4" w:space="0" w:color="BFC7D1"/>
@@ -8341,7 +8363,7 @@
         </w:tc>
         <w:tc>
           <w:tcPr>
-            <w:tcW w:w="2301" w:type="dxa"/>
+            <w:tcW w:w="2416" w:type="dxa"/>
             <w:tcBorders>
               <w:top w:val="single" w:sz="4" w:space="0" w:color="BFC7D1"/>
               <w:left w:val="single" w:sz="4" w:space="0" w:color="BFC7D1"/>
@@ -8378,7 +8400,7 @@
         </w:tc>
         <w:tc>
           <w:tcPr>
-            <w:tcW w:w="2301" w:type="dxa"/>
+            <w:tcW w:w="1763" w:type="dxa"/>
             <w:tcBorders>
               <w:top w:val="single" w:sz="4" w:space="0" w:color="BFC7D1"/>
               <w:left w:val="single" w:sz="4" w:space="0" w:color="BFC7D1"/>
@@ -8418,7 +8440,7 @@
         <w:trPr/>
         <w:tc>
           <w:tcPr>
-            <w:tcW w:w="2109" w:type="dxa"/>
+            <w:tcW w:w="2416" w:type="dxa"/>
             <w:tcBorders>
               <w:top w:val="single" w:sz="4" w:space="0" w:color="BFC7D1"/>
               <w:left w:val="single" w:sz="4" w:space="0" w:color="BFC7D1"/>
@@ -8455,7 +8477,7 @@
         </w:tc>
         <w:tc>
           <w:tcPr>
-            <w:tcW w:w="2301" w:type="dxa"/>
+            <w:tcW w:w="2418" w:type="dxa"/>
             <w:tcBorders>
               <w:top w:val="single" w:sz="4" w:space="0" w:color="BFC7D1"/>
               <w:left w:val="single" w:sz="4" w:space="0" w:color="BFC7D1"/>
@@ -8492,7 +8514,7 @@
         </w:tc>
         <w:tc>
           <w:tcPr>
-            <w:tcW w:w="2301" w:type="dxa"/>
+            <w:tcW w:w="2416" w:type="dxa"/>
             <w:tcBorders>
               <w:top w:val="single" w:sz="4" w:space="0" w:color="BFC7D1"/>
               <w:left w:val="single" w:sz="4" w:space="0" w:color="BFC7D1"/>
@@ -8529,7 +8551,7 @@
         </w:tc>
         <w:tc>
           <w:tcPr>
-            <w:tcW w:w="2301" w:type="dxa"/>
+            <w:tcW w:w="1763" w:type="dxa"/>
             <w:tcBorders>
               <w:top w:val="single" w:sz="4" w:space="0" w:color="BFC7D1"/>
               <w:left w:val="single" w:sz="4" w:space="0" w:color="BFC7D1"/>
@@ -8569,7 +8591,7 @@
         <w:trPr/>
         <w:tc>
           <w:tcPr>
-            <w:tcW w:w="2109" w:type="dxa"/>
+            <w:tcW w:w="2416" w:type="dxa"/>
             <w:tcBorders>
               <w:top w:val="single" w:sz="4" w:space="0" w:color="BFC7D1"/>
               <w:left w:val="single" w:sz="4" w:space="0" w:color="BFC7D1"/>
@@ -8606,7 +8628,7 @@
         </w:tc>
         <w:tc>
           <w:tcPr>
-            <w:tcW w:w="2301" w:type="dxa"/>
+            <w:tcW w:w="2418" w:type="dxa"/>
             <w:tcBorders>
               <w:top w:val="single" w:sz="4" w:space="0" w:color="BFC7D1"/>
               <w:left w:val="single" w:sz="4" w:space="0" w:color="BFC7D1"/>
@@ -8643,7 +8665,7 @@
         </w:tc>
         <w:tc>
           <w:tcPr>
-            <w:tcW w:w="2301" w:type="dxa"/>
+            <w:tcW w:w="2416" w:type="dxa"/>
             <w:tcBorders>
               <w:top w:val="single" w:sz="4" w:space="0" w:color="BFC7D1"/>
               <w:left w:val="single" w:sz="4" w:space="0" w:color="BFC7D1"/>
@@ -8680,7 +8702,7 @@
         </w:tc>
         <w:tc>
           <w:tcPr>
-            <w:tcW w:w="2301" w:type="dxa"/>
+            <w:tcW w:w="1763" w:type="dxa"/>
             <w:tcBorders>
               <w:top w:val="single" w:sz="4" w:space="0" w:color="BFC7D1"/>
               <w:left w:val="single" w:sz="4" w:space="0" w:color="BFC7D1"/>
@@ -8720,7 +8742,7 @@
         <w:trPr/>
         <w:tc>
           <w:tcPr>
-            <w:tcW w:w="2109" w:type="dxa"/>
+            <w:tcW w:w="2416" w:type="dxa"/>
             <w:tcBorders>
               <w:top w:val="single" w:sz="4" w:space="0" w:color="BFC7D1"/>
               <w:left w:val="single" w:sz="4" w:space="0" w:color="BFC7D1"/>
@@ -8757,7 +8779,7 @@
         </w:tc>
         <w:tc>
           <w:tcPr>
-            <w:tcW w:w="2301" w:type="dxa"/>
+            <w:tcW w:w="2418" w:type="dxa"/>
             <w:tcBorders>
               <w:top w:val="single" w:sz="4" w:space="0" w:color="BFC7D1"/>
               <w:left w:val="single" w:sz="4" w:space="0" w:color="BFC7D1"/>
@@ -8794,7 +8816,7 @@
         </w:tc>
         <w:tc>
           <w:tcPr>
-            <w:tcW w:w="2301" w:type="dxa"/>
+            <w:tcW w:w="2416" w:type="dxa"/>
             <w:tcBorders>
               <w:top w:val="single" w:sz="4" w:space="0" w:color="BFC7D1"/>
               <w:left w:val="single" w:sz="4" w:space="0" w:color="BFC7D1"/>
@@ -8831,7 +8853,7 @@
         </w:tc>
         <w:tc>
           <w:tcPr>
-            <w:tcW w:w="2301" w:type="dxa"/>
+            <w:tcW w:w="1763" w:type="dxa"/>
             <w:tcBorders>
               <w:top w:val="single" w:sz="4" w:space="0" w:color="BFC7D1"/>
               <w:left w:val="single" w:sz="4" w:space="0" w:color="BFC7D1"/>
@@ -8871,81 +8893,81 @@
         <w:trPr/>
         <w:tc>
           <w:tcPr>
-            <w:tcW w:w="2109" w:type="dxa"/>
-            <w:tcBorders>
-              <w:top w:val="single" w:sz="4" w:space="0" w:color="BFC7D1"/>
-              <w:left w:val="single" w:sz="4" w:space="0" w:color="BFC7D1"/>
-              <w:bottom w:val="single" w:sz="4" w:space="0" w:color="BFC7D1"/>
-              <w:right w:val="single" w:sz="4" w:space="0" w:color="BFC7D1"/>
-            </w:tcBorders>
-          </w:tcPr>
-          <w:p>
-            <w:pPr>
-              <w:pStyle w:val="Normal"/>
-              <w:widowControl/>
-              <w:spacing w:lineRule="auto" w:line="240" w:before="0" w:after="20"/>
-              <w:jc w:val="left"/>
-              <w:rPr>
-                <w:rFonts w:ascii="Aptos" w:hAnsi="Aptos" w:eastAsia="ＭＳ 明朝" w:cs="Arial"/>
-                <w:kern w:val="0"/>
-                <w:sz w:val="24"/>
-                <w:szCs w:val="24"/>
-                <w:lang w:val="en-US" w:eastAsia="ja-JP" w:bidi="ar-SA"/>
-              </w:rPr>
-            </w:pPr>
-            <w:r>
-              <w:rPr>
-                <w:rFonts w:eastAsia="Segoe UI" w:cs="Segoe UI" w:ascii="Segoe UI" w:hAnsi="Segoe UI"/>
-                <w:color w:val="101820"/>
-                <w:kern w:val="0"/>
-                <w:sz w:val="18"/>
-                <w:szCs w:val="24"/>
-                <w:lang w:val="en-US" w:eastAsia="ja-JP" w:bidi="ar-SA"/>
-              </w:rPr>
-              <w:t>Features in development (package G)</w:t>
-            </w:r>
-          </w:p>
-        </w:tc>
-        <w:tc>
-          <w:tcPr>
-            <w:tcW w:w="2301" w:type="dxa"/>
-            <w:tcBorders>
-              <w:top w:val="single" w:sz="4" w:space="0" w:color="BFC7D1"/>
-              <w:left w:val="single" w:sz="4" w:space="0" w:color="BFC7D1"/>
-              <w:bottom w:val="single" w:sz="4" w:space="0" w:color="BFC7D1"/>
-              <w:right w:val="single" w:sz="4" w:space="0" w:color="BFC7D1"/>
-            </w:tcBorders>
-          </w:tcPr>
-          <w:p>
-            <w:pPr>
-              <w:pStyle w:val="Normal"/>
-              <w:widowControl/>
-              <w:spacing w:lineRule="auto" w:line="240" w:before="0" w:after="20"/>
-              <w:jc w:val="left"/>
-              <w:rPr>
-                <w:rFonts w:ascii="Aptos" w:hAnsi="Aptos" w:eastAsia="ＭＳ 明朝" w:cs="Arial"/>
-                <w:kern w:val="0"/>
-                <w:sz w:val="24"/>
-                <w:szCs w:val="24"/>
-                <w:lang w:val="en-US" w:eastAsia="ja-JP" w:bidi="ar-SA"/>
-              </w:rPr>
-            </w:pPr>
-            <w:r>
-              <w:rPr>
-                <w:rFonts w:eastAsia="Segoe UI" w:cs="Segoe UI" w:ascii="Segoe UI" w:hAnsi="Segoe UI"/>
-                <w:color w:val="101820"/>
-                <w:kern w:val="0"/>
-                <w:sz w:val="18"/>
-                <w:szCs w:val="24"/>
-                <w:lang w:val="en-US" w:eastAsia="ja-JP" w:bidi="ar-SA"/>
-              </w:rPr>
-              <w:t>Sales activity log, quote wizard covers and risk fields from the Product Configurator, supplier BIR 2307, fixed asset disposal</w:t>
-            </w:r>
-          </w:p>
-        </w:tc>
-        <w:tc>
-          <w:tcPr>
-            <w:tcW w:w="2301" w:type="dxa"/>
+            <w:tcW w:w="2416" w:type="dxa"/>
+            <w:tcBorders>
+              <w:top w:val="single" w:sz="4" w:space="0" w:color="BFC7D1"/>
+              <w:left w:val="single" w:sz="4" w:space="0" w:color="BFC7D1"/>
+              <w:bottom w:val="single" w:sz="4" w:space="0" w:color="BFC7D1"/>
+              <w:right w:val="single" w:sz="4" w:space="0" w:color="BFC7D1"/>
+            </w:tcBorders>
+          </w:tcPr>
+          <w:p>
+            <w:pPr>
+              <w:pStyle w:val="Normal"/>
+              <w:widowControl/>
+              <w:spacing w:lineRule="auto" w:line="240" w:before="0" w:after="20"/>
+              <w:jc w:val="left"/>
+              <w:rPr>
+                <w:rFonts w:ascii="Aptos" w:hAnsi="Aptos" w:eastAsia="ＭＳ 明朝" w:cs="Arial"/>
+                <w:kern w:val="0"/>
+                <w:sz w:val="24"/>
+                <w:szCs w:val="24"/>
+                <w:lang w:val="en-US" w:eastAsia="ja-JP" w:bidi="ar-SA"/>
+              </w:rPr>
+            </w:pPr>
+            <w:r>
+              <w:rPr>
+                <w:rFonts w:eastAsia="Segoe UI" w:cs="Segoe UI" w:ascii="Segoe UI" w:hAnsi="Segoe UI"/>
+                <w:color w:val="101820"/>
+                <w:kern w:val="0"/>
+                <w:sz w:val="18"/>
+                <w:szCs w:val="24"/>
+                <w:lang w:val="en-US" w:eastAsia="ja-JP" w:bidi="ar-SA"/>
+              </w:rPr>
+              <w:t>Sales activities, product covers and risk fields, supplier BIR 2307, asset disposal</w:t>
+            </w:r>
+          </w:p>
+        </w:tc>
+        <w:tc>
+          <w:tcPr>
+            <w:tcW w:w="2418" w:type="dxa"/>
+            <w:tcBorders>
+              <w:top w:val="single" w:sz="4" w:space="0" w:color="BFC7D1"/>
+              <w:left w:val="single" w:sz="4" w:space="0" w:color="BFC7D1"/>
+              <w:bottom w:val="single" w:sz="4" w:space="0" w:color="BFC7D1"/>
+              <w:right w:val="single" w:sz="4" w:space="0" w:color="BFC7D1"/>
+            </w:tcBorders>
+          </w:tcPr>
+          <w:p>
+            <w:pPr>
+              <w:pStyle w:val="Normal"/>
+              <w:widowControl/>
+              <w:spacing w:lineRule="auto" w:line="240" w:before="0" w:after="20"/>
+              <w:jc w:val="left"/>
+              <w:rPr>
+                <w:rFonts w:ascii="Aptos" w:hAnsi="Aptos" w:eastAsia="ＭＳ 明朝" w:cs="Arial"/>
+                <w:kern w:val="0"/>
+                <w:sz w:val="24"/>
+                <w:szCs w:val="24"/>
+                <w:lang w:val="en-US" w:eastAsia="ja-JP" w:bidi="ar-SA"/>
+              </w:rPr>
+            </w:pPr>
+            <w:r>
+              <w:rPr>
+                <w:rFonts w:eastAsia="Segoe UI" w:cs="Segoe UI" w:ascii="Segoe UI" w:hAnsi="Segoe UI"/>
+                <w:color w:val="101820"/>
+                <w:kern w:val="0"/>
+                <w:sz w:val="18"/>
+                <w:szCs w:val="24"/>
+                <w:lang w:val="en-US" w:eastAsia="ja-JP" w:bidi="ar-SA"/>
+              </w:rPr>
+              <w:t>Sales activity log and report, quote wizard covers and risk fields from the Product Configurator, supplier BIR 2307 and supplier EWT in the returns, fixed asset disposal</w:t>
+            </w:r>
+          </w:p>
+        </w:tc>
+        <w:tc>
+          <w:tcPr>
+            <w:tcW w:w="2416" w:type="dxa"/>
             <w:tcBorders>
               <w:top w:val="single" w:sz="4" w:space="0" w:color="BFC7D1"/>
               <w:left w:val="single" w:sz="4" w:space="0" w:color="BFC7D1"/>
@@ -8982,38 +9004,38 @@
         </w:tc>
         <w:tc>
           <w:tcPr>
-            <w:tcW w:w="2301" w:type="dxa"/>
-            <w:tcBorders>
-              <w:top w:val="single" w:sz="4" w:space="0" w:color="BFC7D1"/>
-              <w:left w:val="single" w:sz="4" w:space="0" w:color="BFC7D1"/>
-              <w:bottom w:val="single" w:sz="4" w:space="0" w:color="BFC7D1"/>
-              <w:right w:val="single" w:sz="4" w:space="0" w:color="BFC7D1"/>
-            </w:tcBorders>
-          </w:tcPr>
-          <w:p>
-            <w:pPr>
-              <w:pStyle w:val="Normal"/>
-              <w:widowControl/>
-              <w:spacing w:lineRule="auto" w:line="240" w:before="0" w:after="20"/>
-              <w:jc w:val="left"/>
-              <w:rPr>
-                <w:rFonts w:ascii="Aptos" w:hAnsi="Aptos" w:eastAsia="ＭＳ 明朝" w:cs="Arial"/>
-                <w:kern w:val="0"/>
-                <w:sz w:val="24"/>
-                <w:szCs w:val="24"/>
-                <w:lang w:val="en-US" w:eastAsia="ja-JP" w:bidi="ar-SA"/>
-              </w:rPr>
-            </w:pPr>
-            <w:r>
-              <w:rPr>
-                <w:rFonts w:eastAsia="Segoe UI" w:cs="Segoe UI" w:ascii="Segoe UI" w:hAnsi="Segoe UI"/>
-                <w:color w:val="101820"/>
-                <w:kern w:val="0"/>
-                <w:sz w:val="18"/>
-                <w:szCs w:val="24"/>
-                <w:lang w:val="en-US" w:eastAsia="ja-JP" w:bidi="ar-SA"/>
-              </w:rPr>
-              <w:t>Added when the release that carries them is deployed</w:t>
+            <w:tcW w:w="1763" w:type="dxa"/>
+            <w:tcBorders>
+              <w:top w:val="single" w:sz="4" w:space="0" w:color="BFC7D1"/>
+              <w:left w:val="single" w:sz="4" w:space="0" w:color="BFC7D1"/>
+              <w:bottom w:val="single" w:sz="4" w:space="0" w:color="BFC7D1"/>
+              <w:right w:val="single" w:sz="4" w:space="0" w:color="BFC7D1"/>
+            </w:tcBorders>
+          </w:tcPr>
+          <w:p>
+            <w:pPr>
+              <w:pStyle w:val="Normal"/>
+              <w:widowControl/>
+              <w:spacing w:lineRule="auto" w:line="240" w:before="0" w:after="20"/>
+              <w:jc w:val="left"/>
+              <w:rPr>
+                <w:rFonts w:ascii="Aptos" w:hAnsi="Aptos" w:eastAsia="ＭＳ 明朝" w:cs="Arial"/>
+                <w:kern w:val="0"/>
+                <w:sz w:val="24"/>
+                <w:szCs w:val="24"/>
+                <w:lang w:val="en-US" w:eastAsia="ja-JP" w:bidi="ar-SA"/>
+              </w:rPr>
+            </w:pPr>
+            <w:r>
+              <w:rPr>
+                <w:rFonts w:eastAsia="Segoe UI" w:cs="Segoe UI" w:ascii="Segoe UI" w:hAnsi="Segoe UI"/>
+                <w:color w:val="101820"/>
+                <w:kern w:val="0"/>
+                <w:sz w:val="18"/>
+                <w:szCs w:val="24"/>
+                <w:lang w:val="en-US" w:eastAsia="ja-JP" w:bidi="ar-SA"/>
+              </w:rPr>
+              <w:t>Delivered; cases run in UAT cycle 1</w:t>
             </w:r>
           </w:p>
         </w:tc>
@@ -9034,7 +9056,7 @@
         <w:pStyle w:val="Heading2"/>
         <w:rPr/>
       </w:pPr>
-      <w:bookmarkStart w:id="11" w:name="__RefHeading___Toc14861_1139806449"/>
+      <w:bookmarkStart w:id="11" w:name="__RefHeading___Toc3350_449795556"/>
       <w:bookmarkEnd w:id="11"/>
       <w:r>
         <w:rPr>
@@ -9043,7 +9065,225 @@
           <w:color w:val="0F4761"/>
           <w:sz w:val="26"/>
         </w:rPr>
-        <w:t>4.2  Out of scope</w:t>
+        <w:t>4.2  UI standard check</w:t>
+      </w:r>
+    </w:p>
+    <w:p>
+      <w:pPr>
+        <w:pStyle w:val="Normal"/>
+        <w:spacing w:lineRule="auto" w:line="276" w:before="0" w:after="120"/>
+        <w:rPr/>
+      </w:pPr>
+      <w:r>
+        <w:rPr>
+          <w:rFonts w:eastAsia="Segoe UI" w:cs="Segoe UI" w:ascii="Segoe UI" w:hAnsi="Segoe UI"/>
+          <w:color w:val="101820"/>
+          <w:sz w:val="21"/>
+        </w:rPr>
+        <w:t>Every screen in scope is checked once against the Enterprise UI standard of the Technical Reference (section Enterprise UI standard), as part of the screen check per role in SIT cycle 1 and again for every screen changed by a fix. The tester opens the screen as each role at a 1280px window, triggers one success and one error message and opens each dialog, and confirms:</w:t>
+      </w:r>
+    </w:p>
+    <w:p>
+      <w:pPr>
+        <w:pStyle w:val="Normal"/>
+        <w:numPr>
+          <w:ilvl w:val="0"/>
+          <w:numId w:val="1"/>
+        </w:numPr>
+        <w:spacing w:before="0" w:after="60"/>
+        <w:rPr/>
+      </w:pPr>
+      <w:r>
+        <w:rPr>
+          <w:rFonts w:eastAsia="Segoe UI" w:cs="Segoe UI" w:ascii="Segoe UI" w:hAnsi="Segoe UI"/>
+          <w:color w:val="101820"/>
+          <w:sz w:val="21"/>
+        </w:rPr>
+        <w:t>Page header: one title, a breadcrumb, actions on the right with the primary action last.</w:t>
+      </w:r>
+    </w:p>
+    <w:p>
+      <w:pPr>
+        <w:pStyle w:val="Normal"/>
+        <w:numPr>
+          <w:ilvl w:val="0"/>
+          <w:numId w:val="1"/>
+        </w:numPr>
+        <w:spacing w:before="0" w:after="60"/>
+        <w:rPr/>
+      </w:pPr>
+      <w:r>
+        <w:rPr>
+          <w:rFonts w:eastAsia="Segoe UI" w:cs="Segoe UI" w:ascii="Segoe UI" w:hAnsi="Segoe UI"/>
+          <w:color w:val="101820"/>
+          <w:sz w:val="21"/>
+        </w:rPr>
+        <w:t>Summary figures as compact strips: no dials, gauges, large icons or coloured card edges.</w:t>
+      </w:r>
+    </w:p>
+    <w:p>
+      <w:pPr>
+        <w:pStyle w:val="Normal"/>
+        <w:numPr>
+          <w:ilvl w:val="0"/>
+          <w:numId w:val="1"/>
+        </w:numPr>
+        <w:spacing w:before="0" w:after="60"/>
+        <w:rPr/>
+      </w:pPr>
+      <w:r>
+        <w:rPr>
+          <w:rFonts w:eastAsia="Segoe UI" w:cs="Segoe UI" w:ascii="Segoe UI" w:hAnsi="Segoe UI"/>
+          <w:color w:val="101820"/>
+          <w:sz w:val="21"/>
+        </w:rPr>
+        <w:t>Tables: one row height, numbers and dates right-aligned on one line, status as a quiet tag, a figure out of 100 as a thin bar with the value written beside it (not inside it).</w:t>
+      </w:r>
+    </w:p>
+    <w:p>
+      <w:pPr>
+        <w:pStyle w:val="Normal"/>
+        <w:numPr>
+          <w:ilvl w:val="0"/>
+          <w:numId w:val="1"/>
+        </w:numPr>
+        <w:spacing w:before="0" w:after="60"/>
+        <w:rPr/>
+      </w:pPr>
+      <w:r>
+        <w:rPr>
+          <w:rFonts w:eastAsia="Segoe UI" w:cs="Segoe UI" w:ascii="Segoe UI" w:hAnsi="Segoe UI"/>
+          <w:color w:val="101820"/>
+          <w:sz w:val="21"/>
+        </w:rPr>
+        <w:t>Forms: one input height, number spinners as quiet buttons inside the field, a year or period as a drop-down, a select button with one visibly selected segment, filters above the list and actions in the header or footer.</w:t>
+      </w:r>
+    </w:p>
+    <w:p>
+      <w:pPr>
+        <w:pStyle w:val="Normal"/>
+        <w:numPr>
+          <w:ilvl w:val="0"/>
+          <w:numId w:val="1"/>
+        </w:numPr>
+        <w:spacing w:before="0" w:after="60"/>
+        <w:rPr/>
+      </w:pPr>
+      <w:r>
+        <w:rPr>
+          <w:rFonts w:eastAsia="Segoe UI" w:cs="Segoe UI" w:ascii="Segoe UI" w:hAnsi="Segoe UI"/>
+          <w:color w:val="101820"/>
+          <w:sz w:val="21"/>
+        </w:rPr>
+        <w:t>Buttons: one filled primary button per action bar, the others outlined or text; never a row of filled buttons.</w:t>
+      </w:r>
+    </w:p>
+    <w:p>
+      <w:pPr>
+        <w:pStyle w:val="Normal"/>
+        <w:numPr>
+          <w:ilvl w:val="0"/>
+          <w:numId w:val="1"/>
+        </w:numPr>
+        <w:spacing w:before="0" w:after="60"/>
+        <w:rPr/>
+      </w:pPr>
+      <w:r>
+        <w:rPr>
+          <w:rFonts w:eastAsia="Segoe UI" w:cs="Segoe UI" w:ascii="Segoe UI" w:hAnsi="Segoe UI"/>
+          <w:color w:val="101820"/>
+          <w:sz w:val="21"/>
+        </w:rPr>
+        <w:t>Messages and toasts: white or neutral tint with a thin coloured rule on the left and dark text; information boxes grey with the rule in the brand colour; no pink or saturated red surface.</w:t>
+      </w:r>
+    </w:p>
+    <w:p>
+      <w:pPr>
+        <w:pStyle w:val="Normal"/>
+        <w:numPr>
+          <w:ilvl w:val="0"/>
+          <w:numId w:val="1"/>
+        </w:numPr>
+        <w:spacing w:before="0" w:after="60"/>
+        <w:rPr/>
+      </w:pPr>
+      <w:r>
+        <w:rPr>
+          <w:rFonts w:eastAsia="Segoe UI" w:cs="Segoe UI" w:ascii="Segoe UI" w:hAnsi="Segoe UI"/>
+          <w:color w:val="101820"/>
+          <w:sz w:val="21"/>
+        </w:rPr>
+        <w:t>Charts: straight lines, plain captions, no gradients.</w:t>
+      </w:r>
+    </w:p>
+    <w:p>
+      <w:pPr>
+        <w:pStyle w:val="Normal"/>
+        <w:numPr>
+          <w:ilvl w:val="0"/>
+          <w:numId w:val="1"/>
+        </w:numPr>
+        <w:spacing w:before="0" w:after="60"/>
+        <w:rPr/>
+      </w:pPr>
+      <w:r>
+        <w:rPr>
+          <w:rFonts w:eastAsia="Segoe UI" w:cs="Segoe UI" w:ascii="Segoe UI" w:hAnsi="Segoe UI"/>
+          <w:color w:val="101820"/>
+          <w:sz w:val="21"/>
+        </w:rPr>
+        <w:t>Colour and icons: the brand colour only for the primary action, links and the selected state; icons 16 to 18px, no decorative icons.</w:t>
+      </w:r>
+    </w:p>
+    <w:p>
+      <w:pPr>
+        <w:pStyle w:val="Normal"/>
+        <w:numPr>
+          <w:ilvl w:val="0"/>
+          <w:numId w:val="1"/>
+        </w:numPr>
+        <w:spacing w:before="0" w:after="60"/>
+        <w:rPr/>
+      </w:pPr>
+      <w:r>
+        <w:rPr>
+          <w:rFonts w:eastAsia="Segoe UI" w:cs="Segoe UI" w:ascii="Segoe UI" w:hAnsi="Segoe UI"/>
+          <w:color w:val="101820"/>
+          <w:sz w:val="21"/>
+        </w:rPr>
+        <w:t>Dialogs: white, form dialogs as a side panel, confirmations centred, one primary button.</w:t>
+      </w:r>
+    </w:p>
+    <w:p>
+      <w:pPr>
+        <w:pStyle w:val="Normal"/>
+        <w:spacing w:lineRule="auto" w:line="276" w:before="0" w:after="120"/>
+        <w:rPr/>
+      </w:pPr>
+      <w:r>
+        <w:rPr>
+          <w:rFonts w:eastAsia="Segoe UI" w:cs="Segoe UI" w:ascii="Segoe UI" w:hAnsi="Segoe UI"/>
+          <w:color w:val="101820"/>
+          <w:sz w:val="21"/>
+        </w:rPr>
+        <w:t>A deviation is logged as a severity 4 defect (severity 3 when the selected state, the value of a meter or a message cannot be read) with the screen, the role and a screenshot; the test case prefix is BV-SCR.</w:t>
+      </w:r>
+    </w:p>
+    <w:p>
+      <w:pPr>
+        <w:pStyle w:val="Heading2"/>
+        <w:rPr/>
+      </w:pPr>
+      <w:bookmarkStart w:id="12" w:name="__RefHeading___Toc3352_449795556"/>
+      <w:bookmarkEnd w:id="12"/>
+      <w:r>
+        <w:rPr>
+          <w:rFonts w:eastAsia="Segoe UI" w:cs="Segoe UI"/>
+          <w:b/>
+          <w:color w:val="0F4761"/>
+          <w:sz w:val="26"/>
+        </w:rPr>
+        <w:t>4.3  Out of scope</w:t>
       </w:r>
     </w:p>
     <w:p>
@@ -9130,8 +9370,8 @@
         <w:pStyle w:val="Heading1"/>
         <w:rPr/>
       </w:pPr>
-      <w:bookmarkStart w:id="12" w:name="__RefHeading___Toc14863_1139806449"/>
-      <w:bookmarkEnd w:id="12"/>
+      <w:bookmarkStart w:id="13" w:name="__RefHeading___Toc3354_449795556"/>
+      <w:bookmarkEnd w:id="13"/>
       <w:r>
         <w:rPr>
           <w:rFonts w:eastAsia="Segoe UI" w:cs="Segoe UI" w:ascii="Segoe UI" w:hAnsi="Segoe UI"/>
@@ -9147,8 +9387,8 @@
         <w:pStyle w:val="Heading2"/>
         <w:rPr/>
       </w:pPr>
-      <w:bookmarkStart w:id="13" w:name="__RefHeading___Toc14865_1139806449"/>
-      <w:bookmarkEnd w:id="13"/>
+      <w:bookmarkStart w:id="14" w:name="__RefHeading___Toc3356_449795556"/>
+      <w:bookmarkEnd w:id="14"/>
       <w:r>
         <w:rPr>
           <w:rFonts w:eastAsia="Segoe UI" w:cs="Segoe UI"/>
@@ -10457,8 +10697,8 @@
         <w:pStyle w:val="Heading2"/>
         <w:rPr/>
       </w:pPr>
-      <w:bookmarkStart w:id="14" w:name="__RefHeading___Toc14867_1139806449"/>
-      <w:bookmarkEnd w:id="14"/>
+      <w:bookmarkStart w:id="15" w:name="__RefHeading___Toc3358_449795556"/>
+      <w:bookmarkEnd w:id="15"/>
       <w:r>
         <w:rPr>
           <w:rFonts w:eastAsia="Segoe UI" w:cs="Segoe UI"/>
@@ -10922,7 +11162,7 @@
                 <w:szCs w:val="24"/>
                 <w:lang w:val="en-US" w:eastAsia="ja-JP" w:bidi="ar-SA"/>
               </w:rPr>
-              <w:t>UAT scenario on the configured system; life-cycle plan; test cases of every in-scope module; screen check per role</w:t>
+              <w:t>UAT scenario on the configured system; life-cycle plan; test cases of every in-scope module; screen check per role with the UI standard check</w:t>
             </w:r>
           </w:p>
         </w:tc>
@@ -12307,8 +12547,8 @@
         <w:pStyle w:val="Heading2"/>
         <w:rPr/>
       </w:pPr>
-      <w:bookmarkStart w:id="15" w:name="__RefHeading___Toc14869_1139806449"/>
-      <w:bookmarkEnd w:id="15"/>
+      <w:bookmarkStart w:id="16" w:name="__RefHeading___Toc3360_449795556"/>
+      <w:bookmarkEnd w:id="16"/>
       <w:r>
         <w:rPr>
           <w:rFonts w:eastAsia="Segoe UI" w:cs="Segoe UI"/>
@@ -13758,8 +13998,8 @@
         <w:pStyle w:val="Heading1"/>
         <w:rPr/>
       </w:pPr>
-      <w:bookmarkStart w:id="16" w:name="__RefHeading___Toc14871_1139806449"/>
-      <w:bookmarkEnd w:id="16"/>
+      <w:bookmarkStart w:id="17" w:name="__RefHeading___Toc3362_449795556"/>
+      <w:bookmarkEnd w:id="17"/>
       <w:r>
         <w:rPr>
           <w:rFonts w:eastAsia="Segoe UI" w:cs="Segoe UI" w:ascii="Segoe UI" w:hAnsi="Segoe UI"/>
@@ -13889,8 +14129,8 @@
         <w:pStyle w:val="Heading1"/>
         <w:rPr/>
       </w:pPr>
-      <w:bookmarkStart w:id="17" w:name="__RefHeading___Toc14873_1139806449"/>
-      <w:bookmarkEnd w:id="17"/>
+      <w:bookmarkStart w:id="18" w:name="__RefHeading___Toc3364_449795556"/>
+      <w:bookmarkEnd w:id="18"/>
       <w:r>
         <w:rPr>
           <w:rFonts w:eastAsia="Segoe UI" w:cs="Segoe UI" w:ascii="Segoe UI" w:hAnsi="Segoe UI"/>
@@ -15904,8 +16144,8 @@
       <w:r>
         <w:br w:type="page"/>
       </w:r>
-      <w:bookmarkStart w:id="18" w:name="__RefHeading___Toc14875_1139806449"/>
-      <w:bookmarkEnd w:id="18"/>
+      <w:bookmarkStart w:id="19" w:name="__RefHeading___Toc3366_449795556"/>
+      <w:bookmarkEnd w:id="19"/>
       <w:r>
         <w:rPr>
           <w:rFonts w:eastAsia="Segoe UI" w:cs="Segoe UI" w:ascii="Segoe UI" w:hAnsi="Segoe UI"/>
@@ -17488,8 +17728,8 @@
         <w:pStyle w:val="Heading1"/>
         <w:rPr/>
       </w:pPr>
-      <w:bookmarkStart w:id="19" w:name="__RefHeading___Toc14877_1139806449"/>
-      <w:bookmarkEnd w:id="19"/>
+      <w:bookmarkStart w:id="20" w:name="__RefHeading___Toc3368_449795556"/>
+      <w:bookmarkEnd w:id="20"/>
       <w:r>
         <w:rPr>
           <w:rFonts w:eastAsia="Segoe UI" w:cs="Segoe UI" w:ascii="Segoe UI" w:hAnsi="Segoe UI"/>
@@ -17505,8 +17745,8 @@
         <w:pStyle w:val="Heading2"/>
         <w:rPr/>
       </w:pPr>
-      <w:bookmarkStart w:id="20" w:name="__RefHeading___Toc14879_1139806449"/>
-      <w:bookmarkEnd w:id="20"/>
+      <w:bookmarkStart w:id="21" w:name="__RefHeading___Toc3370_449795556"/>
+      <w:bookmarkEnd w:id="21"/>
       <w:r>
         <w:rPr>
           <w:rFonts w:eastAsia="Segoe UI" w:cs="Segoe UI"/>
@@ -17632,8 +17872,8 @@
         <w:pStyle w:val="Heading2"/>
         <w:rPr/>
       </w:pPr>
-      <w:bookmarkStart w:id="21" w:name="__RefHeading___Toc14881_1139806449"/>
-      <w:bookmarkEnd w:id="21"/>
+      <w:bookmarkStart w:id="22" w:name="__RefHeading___Toc3372_449795556"/>
+      <w:bookmarkEnd w:id="22"/>
       <w:r>
         <w:rPr>
           <w:rFonts w:eastAsia="Segoe UI" w:cs="Segoe UI"/>
@@ -17667,8 +17907,8 @@
         <w:pStyle w:val="Heading1"/>
         <w:rPr/>
       </w:pPr>
-      <w:bookmarkStart w:id="22" w:name="__RefHeading___Toc14883_1139806449"/>
-      <w:bookmarkEnd w:id="22"/>
+      <w:bookmarkStart w:id="23" w:name="__RefHeading___Toc3374_449795556"/>
+      <w:bookmarkEnd w:id="23"/>
       <w:r>
         <w:rPr>
           <w:rFonts w:eastAsia="Segoe UI" w:cs="Segoe UI" w:ascii="Segoe UI" w:hAnsi="Segoe UI"/>
@@ -18528,9 +18768,9 @@
       <w:r>
         <w:br w:type="page"/>
       </w:r>
-      <w:bookmarkStart w:id="23" w:name="__RefHeading___Toc14885_1139806449"/>
-      <w:bookmarkStart w:id="24" w:name="_Toc233203395"/>
-      <w:bookmarkEnd w:id="23"/>
+      <w:bookmarkStart w:id="24" w:name="__RefHeading___Toc3376_449795556"/>
+      <w:bookmarkStart w:id="25" w:name="_Toc233203395"/>
+      <w:bookmarkEnd w:id="24"/>
       <w:r>
         <w:rPr>
           <w:rStyle w:val="BookTitle"/>
@@ -18541,7 +18781,7 @@
         </w:rPr>
         <w:t>11.  Document Sign-Off</w:t>
       </w:r>
-      <w:bookmarkEnd w:id="24"/>
+      <w:bookmarkEnd w:id="25"/>
     </w:p>
     <w:p>
       <w:pPr>
@@ -20287,7 +20527,7 @@
       <w:r>
         <w:rPr/>
         <w:drawing>
-          <wp:anchor behindDoc="1" distT="0" distB="0" distL="0" distR="0" simplePos="0" locked="0" layoutInCell="0" allowOverlap="1" relativeHeight="20">
+          <wp:anchor behindDoc="1" distT="0" distB="0" distL="0" distR="0" simplePos="0" locked="0" layoutInCell="0" allowOverlap="1" relativeHeight="21">
             <wp:simplePos x="0" y="0"/>
             <wp:positionH relativeFrom="margin">
               <wp:align>center</wp:align>
@@ -20358,7 +20598,7 @@
     <w:r>
       <w:rPr/>
       <w:drawing>
-        <wp:anchor behindDoc="1" distT="0" distB="0" distL="0" distR="0" simplePos="0" locked="0" layoutInCell="0" allowOverlap="1" relativeHeight="18">
+        <wp:anchor behindDoc="1" distT="0" distB="0" distL="0" distR="0" simplePos="0" locked="0" layoutInCell="0" allowOverlap="1" relativeHeight="19">
           <wp:simplePos x="0" y="0"/>
           <wp:positionH relativeFrom="page">
             <wp:align>left</wp:align>
@@ -20417,7 +20657,7 @@
     <w:r>
       <w:rPr/>
       <w:drawing>
-        <wp:anchor behindDoc="1" distT="0" distB="0" distL="0" distR="0" simplePos="0" locked="0" layoutInCell="0" allowOverlap="1" relativeHeight="18">
+        <wp:anchor behindDoc="1" distT="0" distB="0" distL="0" distR="0" simplePos="0" locked="0" layoutInCell="0" allowOverlap="1" relativeHeight="19">
           <wp:simplePos x="0" y="0"/>
           <wp:positionH relativeFrom="page">
             <wp:align>left</wp:align>

</xml_diff>